<commit_message>
Add standalone SETUP_GUIDE.md and redraw the architecture diagram as a clean grid
SETUP_GUIDE.md is a second, self-contained walkthrough (alongside
LAB_RUNBOOK.md) that never names a specific machine, written so an
external reader can clone, set up, run, and verify the whole project
from this file alone.

Redrew reports/build_architecture_diagram.py: the previous zigzag
layout used diagonal arrows that crossed through unrelated boxes;
replaced it with a strict grid where every arrow is purely horizontal
or vertical, so nothing crosses by construction. Regenerated the
report so the corrected diagram is embedded there too.
</commit_message>
<xml_diff>
--- a/reports/MLOps_Assignment1_Report.docx
+++ b/reports/MLOps_Assignment1_Report.docx
@@ -59,7 +59,7 @@
         <w:jc w:val="center"/>
       </w:pPr>
       <w:r>
-        <w:t>2026-10-15</w:t>
+        <w:t>2026-10-16</w:t>
       </w:r>
     </w:p>
     <w:p>
@@ -3053,7 +3053,7 @@
       <w:r>
         <w:drawing>
           <wp:inline xmlns:a="http://schemas.openxmlformats.org/drawingml/2006/main" xmlns:pic="http://schemas.openxmlformats.org/drawingml/2006/picture">
-            <wp:extent cx="5943600" cy="3404898"/>
+            <wp:extent cx="5943600" cy="4099909"/>
             <wp:docPr id="14" name="Picture 14"/>
             <wp:cNvGraphicFramePr>
               <a:graphicFrameLocks noChangeAspect="1"/>
@@ -3074,7 +3074,7 @@
                   <pic:spPr>
                     <a:xfrm>
                       <a:off x="0" y="0"/>
-                      <a:ext cx="5943600" cy="3404898"/>
+                      <a:ext cx="5943600" cy="4099909"/>
                     </a:xfrm>
                     <a:prstGeom prst="rect"/>
                   </pic:spPr>

</xml_diff>

<commit_message>
generated reports from bit lap VM after running end to end pipelines
</commit_message>
<xml_diff>
--- a/reports/MLOps_Assignment1_Report.docx
+++ b/reports/MLOps_Assignment1_Report.docx
@@ -748,7 +748,7 @@
       <w:r>
         <w:drawing>
           <wp:inline xmlns:a="http://schemas.openxmlformats.org/drawingml/2006/main" xmlns:pic="http://schemas.openxmlformats.org/drawingml/2006/picture">
-            <wp:extent cx="4206240" cy="2016872"/>
+            <wp:extent cx="4206240" cy="2011433"/>
             <wp:docPr id="1" name="Picture 1"/>
             <wp:cNvGraphicFramePr>
               <a:graphicFrameLocks noChangeAspect="1"/>
@@ -769,7 +769,7 @@
                   <pic:spPr>
                     <a:xfrm>
                       <a:off x="0" y="0"/>
-                      <a:ext cx="4206240" cy="2016872"/>
+                      <a:ext cx="4206240" cy="2011433"/>
                     </a:xfrm>
                     <a:prstGeom prst="rect"/>
                   </pic:spPr>
@@ -799,7 +799,7 @@
       <w:r>
         <w:drawing>
           <wp:inline xmlns:a="http://schemas.openxmlformats.org/drawingml/2006/main" xmlns:pic="http://schemas.openxmlformats.org/drawingml/2006/picture">
-            <wp:extent cx="4206240" cy="1482384"/>
+            <wp:extent cx="4206240" cy="1483755"/>
             <wp:docPr id="2" name="Picture 2"/>
             <wp:cNvGraphicFramePr>
               <a:graphicFrameLocks noChangeAspect="1"/>
@@ -820,7 +820,7 @@
                   <pic:spPr>
                     <a:xfrm>
                       <a:off x="0" y="0"/>
-                      <a:ext cx="4206240" cy="1482384"/>
+                      <a:ext cx="4206240" cy="1483755"/>
                     </a:xfrm>
                     <a:prstGeom prst="rect"/>
                   </pic:spPr>
@@ -850,7 +850,7 @@
       <w:r>
         <w:drawing>
           <wp:inline xmlns:a="http://schemas.openxmlformats.org/drawingml/2006/main" xmlns:pic="http://schemas.openxmlformats.org/drawingml/2006/picture">
-            <wp:extent cx="4206240" cy="2316624"/>
+            <wp:extent cx="4206240" cy="2316768"/>
             <wp:docPr id="3" name="Picture 3"/>
             <wp:cNvGraphicFramePr>
               <a:graphicFrameLocks noChangeAspect="1"/>
@@ -871,7 +871,7 @@
                   <pic:spPr>
                     <a:xfrm>
                       <a:off x="0" y="0"/>
-                      <a:ext cx="4206240" cy="2316624"/>
+                      <a:ext cx="4206240" cy="2316768"/>
                     </a:xfrm>
                     <a:prstGeom prst="rect"/>
                   </pic:spPr>
@@ -901,7 +901,7 @@
       <w:r>
         <w:drawing>
           <wp:inline xmlns:a="http://schemas.openxmlformats.org/drawingml/2006/main" xmlns:pic="http://schemas.openxmlformats.org/drawingml/2006/picture">
-            <wp:extent cx="4206240" cy="3153616"/>
+            <wp:extent cx="4206240" cy="3154325"/>
             <wp:docPr id="4" name="Picture 4"/>
             <wp:cNvGraphicFramePr>
               <a:graphicFrameLocks noChangeAspect="1"/>
@@ -922,7 +922,7 @@
                   <pic:spPr>
                     <a:xfrm>
                       <a:off x="0" y="0"/>
-                      <a:ext cx="4206240" cy="3153616"/>
+                      <a:ext cx="4206240" cy="3154325"/>
                     </a:xfrm>
                     <a:prstGeom prst="rect"/>
                   </pic:spPr>
@@ -952,7 +952,7 @@
       <w:r>
         <w:drawing>
           <wp:inline xmlns:a="http://schemas.openxmlformats.org/drawingml/2006/main" xmlns:pic="http://schemas.openxmlformats.org/drawingml/2006/picture">
-            <wp:extent cx="4206240" cy="3602928"/>
+            <wp:extent cx="4206240" cy="3591352"/>
             <wp:docPr id="5" name="Picture 5"/>
             <wp:cNvGraphicFramePr>
               <a:graphicFrameLocks noChangeAspect="1"/>
@@ -973,7 +973,7 @@
                   <pic:spPr>
                     <a:xfrm>
                       <a:off x="0" y="0"/>
-                      <a:ext cx="4206240" cy="3602928"/>
+                      <a:ext cx="4206240" cy="3591352"/>
                     </a:xfrm>
                     <a:prstGeom prst="rect"/>
                   </pic:spPr>
@@ -1003,7 +1003,7 @@
       <w:r>
         <w:drawing>
           <wp:inline xmlns:a="http://schemas.openxmlformats.org/drawingml/2006/main" xmlns:pic="http://schemas.openxmlformats.org/drawingml/2006/picture">
-            <wp:extent cx="4206240" cy="3265394"/>
+            <wp:extent cx="4206240" cy="3269938"/>
             <wp:docPr id="6" name="Picture 6"/>
             <wp:cNvGraphicFramePr>
               <a:graphicFrameLocks noChangeAspect="1"/>
@@ -1024,7 +1024,7 @@
                   <pic:spPr>
                     <a:xfrm>
                       <a:off x="0" y="0"/>
-                      <a:ext cx="4206240" cy="3265394"/>
+                      <a:ext cx="4206240" cy="3269938"/>
                     </a:xfrm>
                     <a:prstGeom prst="rect"/>
                   </pic:spPr>
@@ -1580,7 +1580,7 @@
     </w:p>
     <w:p>
       <w:r>
-        <w:t>Logistic Regression was selected (highest CV ROC-AUC, 0.9055). The operating threshold (0.2417) was chosen from out-of-fold predicted probabilities to meet a 0.95 recall target on the positive (disease) class — missed disease cases are treated as costlier than false alarms, consistent with a screening-tool framing. Logistic Regression's coefficients give a concrete, interpretable check against the site-leakage risk flagged during EDA: the 'ca is missing' category carries an odds ratio of approximately 1 (no effect), while 'ca = 0' carries the single largest coefficient in the model — evidence that ca is being used for genuine clinical signal where known, not as a shortcut for which hospital a row came from.</w:t>
+        <w:t>Logistic Regression was selected (highest CV ROC-AUC, 0.9055). The operating threshold (0.2419) was chosen from out-of-fold predicted probabilities to meet a 0.95 recall target on the positive (disease) class — missed disease cases are treated as costlier than false alarms, consistent with a screening-tool framing. Logistic Regression's coefficients give a concrete, interpretable check against the site-leakage risk flagged during EDA: the 'ca is missing' category carries an odds ratio of approximately 1 (no effect), while 'ca = 0' carries the single largest coefficient in the model — evidence that ca is being used for genuine clinical signal where known, not as a shortcut for which hospital a row came from.</w:t>
       </w:r>
     </w:p>
     <w:p>
@@ -2603,7 +2603,7 @@
     </w:p>
     <w:p>
       <w:r>
-        <w:t>The selected model is registered as heart_disease_classifier and given the alias 'champion' (version 3 at the time of writing) — not MLflow's deprecated Staging/Production stage system. Serving code resolves the model by alias (models:/heart_disease_classifier@champion), never a hardcoded version number, so promoting a new champion never requires a code change. This was verified to be genuinely mutable by running training twice and confirming the alias moved to the new version automatically, with the old version left unaliased for audit and rollback rather than deleted.</w:t>
+        <w:t>The selected model is registered as heart_disease_classifier and given the alias 'champion' (version 2 at the time of writing) — not MLflow's deprecated Staging/Production stage system. Serving code resolves the model by alias (models:/heart_disease_classifier@champion), never a hardcoded version number, so promoting a new champion never requires a code change. This was verified to be genuinely mutable by running training twice and confirming the alias moved to the new version automatically, with the old version left unaliased for audit and rollback rather than deleted.</w:t>
       </w:r>
     </w:p>
     <w:p>
@@ -2725,7 +2725,7 @@
           </w:tcPr>
           <w:p>
             <w:r>
-              <w:t>3</w:t>
+              <w:t>2</w:t>
             </w:r>
           </w:p>
         </w:tc>
@@ -2747,7 +2747,7 @@
           </w:tcPr>
           <w:p>
             <w:r>
-              <w:t>0.2417</w:t>
+              <w:t>0.2419</w:t>
             </w:r>
           </w:p>
         </w:tc>
@@ -2813,7 +2813,7 @@
           </w:tcPr>
           <w:p>
             <w:r>
-              <w:t>1729e800d9ad</w:t>
+              <w:t>fcd0044439a0</w:t>
             </w:r>
           </w:p>
         </w:tc>
@@ -2835,7 +2835,7 @@
           </w:tcPr>
           <w:p>
             <w:r>
-              <w:t>2026-10-14T05:00:56.606808+00:00</w:t>
+              <w:t>2026-10-16T11:44:37.544396+00:00</w:t>
             </w:r>
           </w:p>
         </w:tc>

</xml_diff>